<commit_message>
Added the V1.0 files
Added all the V1.0 files
</commit_message>
<xml_diff>
--- a/Documentation/Working_Documents/Shrub_Hub_Summary.docx
+++ b/Documentation/Working_Documents/Shrub_Hub_Summary.docx
@@ -144,6 +144,7 @@
     </w:p>
     <w:p>
       <w:pPr>
+        <w:jc w:val="center"/>
         <w:rPr>
           <w:rFonts w:eastAsiaTheme="majorEastAsia" w:cstheme="majorBidi"/>
           <w:b/>
@@ -159,10 +160,10 @@
           <w:noProof/>
         </w:rPr>
         <w:drawing>
-          <wp:inline distT="0" distB="0" distL="0" distR="0" wp14:anchorId="2374B844" wp14:editId="010A1A0B">
-            <wp:extent cx="5943600" cy="3912235"/>
+          <wp:inline distT="0" distB="0" distL="0" distR="0" wp14:anchorId="72DBEA11" wp14:editId="7561A141">
+            <wp:extent cx="4632771" cy="3038475"/>
             <wp:effectExtent l="0" t="0" r="0" b="0"/>
-            <wp:docPr id="1248272696" name="Picture 1" descr="Shrub Hub with the terminal splitter on a grey background"/>
+            <wp:docPr id="1072172605" name="Picture 4" descr="Fully assembled Shrub Hub and 3-to-1 Switch Adapter."/>
             <wp:cNvGraphicFramePr>
               <a:graphicFrameLocks xmlns:a="http://schemas.openxmlformats.org/drawingml/2006/main" noChangeAspect="1"/>
             </wp:cNvGraphicFramePr>
@@ -170,11 +171,69 @@
               <a:graphicData uri="http://schemas.openxmlformats.org/drawingml/2006/picture">
                 <pic:pic xmlns:pic="http://schemas.openxmlformats.org/drawingml/2006/picture">
                   <pic:nvPicPr>
-                    <pic:cNvPr id="1248272696" name="Picture 1" descr="Shrub Hub with the terminal splitter on a grey background"/>
+                    <pic:cNvPr id="1072172605" name="Picture 4"/>
+                    <pic:cNvPicPr>
+                      <a:picLocks noChangeAspect="1" noChangeArrowheads="1"/>
+                    </pic:cNvPicPr>
+                  </pic:nvPicPr>
+                  <pic:blipFill rotWithShape="1">
+                    <a:blip r:embed="rId11" cstate="print">
+                      <a:extLst>
+                        <a:ext uri="{28A0092B-C50C-407E-A947-70E740481C1C}">
+                          <a14:useLocalDpi xmlns:a14="http://schemas.microsoft.com/office/drawing/2010/main" val="0"/>
+                        </a:ext>
+                      </a:extLst>
+                    </a:blip>
+                    <a:srcRect t="32141" b="18476"/>
+                    <a:stretch>
+                      <a:fillRect/>
+                    </a:stretch>
+                  </pic:blipFill>
+                  <pic:spPr bwMode="auto">
+                    <a:xfrm>
+                      <a:off x="0" y="0"/>
+                      <a:ext cx="4665703" cy="3060074"/>
+                    </a:xfrm>
+                    <a:prstGeom prst="rect">
+                      <a:avLst/>
+                    </a:prstGeom>
+                    <a:noFill/>
+                    <a:ln>
+                      <a:noFill/>
+                    </a:ln>
+                    <a:extLst>
+                      <a:ext uri="{53640926-AAD7-44D8-BBD7-CCE9431645EC}">
+                        <a14:shadowObscured xmlns:a14="http://schemas.microsoft.com/office/drawing/2010/main"/>
+                      </a:ext>
+                    </a:extLst>
+                  </pic:spPr>
+                </pic:pic>
+              </a:graphicData>
+            </a:graphic>
+          </wp:inline>
+        </w:drawing>
+      </w:r>
+      <w:r>
+        <w:rPr>
+          <w:noProof/>
+        </w:rPr>
+        <w:drawing>
+          <wp:inline distT="0" distB="0" distL="0" distR="0" wp14:anchorId="15872290" wp14:editId="3605276D">
+            <wp:extent cx="4600575" cy="3132552"/>
+            <wp:effectExtent l="0" t="0" r="0" b="0"/>
+            <wp:docPr id="685247729" name="Picture 1" descr="Fully assembled Shrub Hub."/>
+            <wp:cNvGraphicFramePr>
+              <a:graphicFrameLocks xmlns:a="http://schemas.openxmlformats.org/drawingml/2006/main" noChangeAspect="1"/>
+            </wp:cNvGraphicFramePr>
+            <a:graphic xmlns:a="http://schemas.openxmlformats.org/drawingml/2006/main">
+              <a:graphicData uri="http://schemas.openxmlformats.org/drawingml/2006/picture">
+                <pic:pic xmlns:pic="http://schemas.openxmlformats.org/drawingml/2006/picture">
+                  <pic:nvPicPr>
+                    <pic:cNvPr id="685247729" name="Picture 1" descr="A close up of a usb drive&#10;&#10;AI-generated content may be incorrect."/>
                     <pic:cNvPicPr/>
                   </pic:nvPicPr>
                   <pic:blipFill>
-                    <a:blip r:embed="rId11"/>
+                    <a:blip r:embed="rId12"/>
                     <a:stretch>
                       <a:fillRect/>
                     </a:stretch>
@@ -182,7 +241,7 @@
                   <pic:spPr>
                     <a:xfrm>
                       <a:off x="0" y="0"/>
-                      <a:ext cx="5943600" cy="3912235"/>
+                      <a:ext cx="4613536" cy="3141377"/>
                     </a:xfrm>
                     <a:prstGeom prst="rect">
                       <a:avLst/>
@@ -269,8 +328,8 @@
           <w:szCs w:val="20"/>
         </w:rPr>
         <w:sectPr>
-          <w:headerReference w:type="default" r:id="rId12"/>
-          <w:footerReference w:type="default" r:id="rId13"/>
+          <w:headerReference w:type="default" r:id="rId13"/>
+          <w:footerReference w:type="default" r:id="rId14"/>
           <w:pgSz w:w="12240" w:h="15840"/>
           <w:pgMar w:top="1440" w:right="1440" w:bottom="1440" w:left="1440" w:header="708" w:footer="708" w:gutter="0"/>
           <w:cols w:space="708"/>
@@ -1135,7 +1194,37 @@
         <w:rPr>
           <w:lang w:val="en-US"/>
         </w:rPr>
-        <w:t>switch scan, and control software.</w:t>
+        <w:t xml:space="preserve">switch scan, </w:t>
+      </w:r>
+      <w:r>
+        <w:rPr>
+          <w:lang w:val="en-US"/>
+        </w:rPr>
+        <w:t xml:space="preserve">send mouse clicks, </w:t>
+      </w:r>
+      <w:r>
+        <w:rPr>
+          <w:lang w:val="en-US"/>
+        </w:rPr>
+        <w:t xml:space="preserve">and control </w:t>
+      </w:r>
+      <w:r>
+        <w:rPr>
+          <w:lang w:val="en-US"/>
+        </w:rPr>
+        <w:t>device audio and other media</w:t>
+      </w:r>
+      <w:r>
+        <w:rPr>
+          <w:lang w:val="en-US"/>
+        </w:rPr>
+        <w:t>.</w:t>
+      </w:r>
+      <w:r>
+        <w:rPr>
+          <w:lang w:val="en-US"/>
+        </w:rPr>
+        <w:t xml:space="preserve"> </w:t>
       </w:r>
     </w:p>
     <w:p>
@@ -1166,36 +1255,6 @@
           <w:rFonts w:eastAsia="Times New Roman"/>
           <w:lang w:val="en-US"/>
         </w:rPr>
-        <w:t>Chris Young,</w:t>
-      </w:r>
-    </w:p>
-    <w:p>
-      <w:pPr>
-        <w:rPr>
-          <w:rFonts w:eastAsia="Times New Roman"/>
-          <w:lang w:val="en-US"/>
-        </w:rPr>
-      </w:pPr>
-      <w:r>
-        <w:rPr>
-          <w:rFonts w:eastAsia="Times New Roman"/>
-          <w:lang w:val="en-US"/>
-        </w:rPr>
-        <w:t>Bill Binko,</w:t>
-      </w:r>
-    </w:p>
-    <w:p>
-      <w:pPr>
-        <w:rPr>
-          <w:rFonts w:eastAsia="Times New Roman"/>
-          <w:lang w:val="en-US"/>
-        </w:rPr>
-      </w:pPr>
-      <w:r>
-        <w:rPr>
-          <w:rFonts w:eastAsia="Times New Roman"/>
-          <w:lang w:val="en-US"/>
-        </w:rPr>
         <w:t>Neil Squire Society</w:t>
       </w:r>
     </w:p>
@@ -1272,7 +1331,19 @@
         <w:rPr>
           <w:lang w:val="en-US"/>
         </w:rPr>
-        <w:t>assistive switch inputs and can output up to seven keystrokes to the connected digital device.</w:t>
+        <w:t xml:space="preserve">assistive switch inputs and can output up to </w:t>
+      </w:r>
+      <w:r>
+        <w:rPr>
+          <w:lang w:val="en-US"/>
+        </w:rPr>
+        <w:t>five</w:t>
+      </w:r>
+      <w:r>
+        <w:rPr>
+          <w:lang w:val="en-US"/>
+        </w:rPr>
+        <w:t xml:space="preserve"> keystrokes to the connected digital device.</w:t>
       </w:r>
     </w:p>
     <w:p>
@@ -1746,13 +1817,25 @@
         <w:rPr>
           <w:lang w:val="en-US"/>
         </w:rPr>
-        <w:t xml:space="preserve"> is designed for users who cannot use digital d</w:t>
-      </w:r>
-      <w:r>
-        <w:rPr>
-          <w:lang w:val="en-US"/>
-        </w:rPr>
-        <w:t>evices and needs a digital switch interface to control the device using assistive switches.</w:t>
+        <w:t xml:space="preserve"> is </w:t>
+      </w:r>
+      <w:r>
+        <w:rPr>
+          <w:lang w:val="en-US"/>
+        </w:rPr>
+        <w:t xml:space="preserve">intended </w:t>
+      </w:r>
+      <w:r>
+        <w:rPr>
+          <w:lang w:val="en-US"/>
+        </w:rPr>
+        <w:t>for users who cannot use digital d</w:t>
+      </w:r>
+      <w:r>
+        <w:rPr>
+          <w:lang w:val="en-US"/>
+        </w:rPr>
+        <w:t>evices and need a digital switch interface to control the device using assistive switches.</w:t>
       </w:r>
     </w:p>
     <w:p>
@@ -1792,13 +1875,93 @@
         <w:rPr>
           <w:lang w:val="en-US"/>
         </w:rPr>
-        <w:t xml:space="preserve"> Hub is plugged into a computer or other digital device like a USB flash drive, then </w:t>
-      </w:r>
-      <w:r>
-        <w:rPr>
-          <w:lang w:val="en-US"/>
-        </w:rPr>
-        <w:t xml:space="preserve">up to three assistive switches can be connected to it. </w:t>
+        <w:t xml:space="preserve"> Hub is </w:t>
+      </w:r>
+      <w:r>
+        <w:rPr>
+          <w:lang w:val="en-US"/>
+        </w:rPr>
+        <w:t xml:space="preserve">connected to up to three </w:t>
+      </w:r>
+      <w:r>
+        <w:rPr>
+          <w:lang w:val="en-US"/>
+        </w:rPr>
+        <w:t xml:space="preserve">3.5mm assistive </w:t>
+      </w:r>
+      <w:proofErr w:type="gramStart"/>
+      <w:r>
+        <w:rPr>
+          <w:lang w:val="en-US"/>
+        </w:rPr>
+        <w:t>switches, and</w:t>
+      </w:r>
+      <w:proofErr w:type="gramEnd"/>
+      <w:r>
+        <w:rPr>
+          <w:lang w:val="en-US"/>
+        </w:rPr>
+        <w:t xml:space="preserve"> then </w:t>
+      </w:r>
+      <w:r>
+        <w:rPr>
+          <w:lang w:val="en-US"/>
+        </w:rPr>
+        <w:t>plugged into a computer or other digital device like a USB flash drive</w:t>
+      </w:r>
+      <w:r>
+        <w:rPr>
+          <w:lang w:val="en-US"/>
+        </w:rPr>
+        <w:t xml:space="preserve">. </w:t>
+      </w:r>
+      <w:r>
+        <w:rPr>
+          <w:lang w:val="en-US"/>
+        </w:rPr>
+        <w:t xml:space="preserve">If </w:t>
+      </w:r>
+      <w:r>
+        <w:rPr>
+          <w:lang w:val="en-US"/>
+        </w:rPr>
+        <w:t xml:space="preserve">only using one switch, the </w:t>
+      </w:r>
+      <w:r>
+        <w:rPr>
+          <w:lang w:val="en-US"/>
+        </w:rPr>
+        <w:t>Shrub Hub can be used</w:t>
+      </w:r>
+      <w:r>
+        <w:rPr>
+          <w:lang w:val="en-US"/>
+        </w:rPr>
+        <w:t xml:space="preserve"> without the switch adapter</w:t>
+      </w:r>
+      <w:r>
+        <w:rPr>
+          <w:lang w:val="en-US"/>
+        </w:rPr>
+        <w:t>,</w:t>
+      </w:r>
+      <w:r>
+        <w:rPr>
+          <w:lang w:val="en-US"/>
+        </w:rPr>
+        <w:t xml:space="preserve"> and</w:t>
+      </w:r>
+      <w:r>
+        <w:rPr>
+          <w:lang w:val="en-US"/>
+        </w:rPr>
+        <w:t xml:space="preserve"> the switch can be</w:t>
+      </w:r>
+      <w:r>
+        <w:rPr>
+          <w:lang w:val="en-US"/>
+        </w:rPr>
+        <w:t xml:space="preserve"> plugged directly into the Shrub Hub. </w:t>
       </w:r>
       <w:r>
         <w:rPr>
@@ -1810,7 +1973,31 @@
         <w:rPr>
           <w:lang w:val="en-US"/>
         </w:rPr>
-        <w:t>send a different keystroke, or multiple switches can be pressed at the same time to send a different keystroke than any of the individual buttons. There are four different modes that each have their own unique sets of keystrokes.</w:t>
+        <w:t>send a different keystroke, or multiple switches can be pressed at the same time to send a different keystroke than any of the individual buttons. There are f</w:t>
+      </w:r>
+      <w:r>
+        <w:rPr>
+          <w:lang w:val="en-US"/>
+        </w:rPr>
+        <w:t>ive</w:t>
+      </w:r>
+      <w:r>
+        <w:rPr>
+          <w:lang w:val="en-US"/>
+        </w:rPr>
+        <w:t xml:space="preserve"> different modes that each have their own unique sets of </w:t>
+      </w:r>
+      <w:r>
+        <w:rPr>
+          <w:lang w:val="en-US"/>
+        </w:rPr>
+        <w:t>outputs</w:t>
+      </w:r>
+      <w:r>
+        <w:rPr>
+          <w:lang w:val="en-US"/>
+        </w:rPr>
+        <w:t>.</w:t>
       </w:r>
     </w:p>
     <w:p>
@@ -2114,46 +2301,283 @@
         </w:rPr>
       </w:pPr>
       <w:r>
-        <w:rPr>
-          <w:lang w:val="en-US"/>
-        </w:rPr>
-        <w:t>The initial device and code</w:t>
-      </w:r>
-      <w:r>
-        <w:rPr>
-          <w:lang w:val="en-US"/>
-        </w:rPr>
-        <w:t xml:space="preserve"> that the </w:t>
-      </w:r>
-      <w:r>
-        <w:rPr>
-          <w:lang w:val="en-US"/>
-        </w:rPr>
-        <w:t>Shrub</w:t>
-      </w:r>
-      <w:r>
-        <w:rPr>
-          <w:lang w:val="en-US"/>
-        </w:rPr>
-        <w:t xml:space="preserve"> Hub is based on</w:t>
-      </w:r>
-      <w:r>
-        <w:rPr>
-          <w:lang w:val="en-US"/>
-        </w:rPr>
-        <w:t xml:space="preserve"> was the TRRS Switch Control by </w:t>
-      </w:r>
-      <w:r>
-        <w:rPr>
-          <w:lang w:val="en-US"/>
-        </w:rPr>
-        <w:t>Chris Young and Bill Binko</w:t>
+        <w:t>The device was designed by Neil Squire Society</w:t>
       </w:r>
       <w:r>
         <w:rPr>
           <w:lang w:val="en-US"/>
         </w:rPr>
         <w:t>.</w:t>
+      </w:r>
+    </w:p>
+    <w:p>
+      <w:r>
+        <w:t xml:space="preserve">The Shrub Hub is built using the following commercially available </w:t>
+      </w:r>
+      <w:r>
+        <w:t>open-source</w:t>
+      </w:r>
+      <w:r>
+        <w:t xml:space="preserve"> hardware components:</w:t>
+      </w:r>
+    </w:p>
+    <w:p>
+      <w:r>
+        <w:t xml:space="preserve"> - </w:t>
+      </w:r>
+      <w:hyperlink r:id="rId15" w:history="1">
+        <w:r>
+          <w:rPr>
+            <w:rStyle w:val="Hyperlink"/>
+          </w:rPr>
+          <w:t xml:space="preserve">Adafruit TRRS Trinkey - USB Key for Assistive </w:t>
+        </w:r>
+        <w:r>
+          <w:rPr>
+            <w:rStyle w:val="Hyperlink"/>
+          </w:rPr>
+          <w:t>Technology</w:t>
+        </w:r>
+      </w:hyperlink>
+      <w:r>
+        <w:t>.</w:t>
+      </w:r>
+      <w:r>
+        <w:t xml:space="preserve"> </w:t>
+      </w:r>
+      <w:r>
+        <w:t xml:space="preserve">The PCB design is available under a CC-BY-SA 3.0 license at </w:t>
+      </w:r>
+      <w:hyperlink r:id="rId16" w:history="1">
+        <w:r>
+          <w:rPr>
+            <w:rStyle w:val="Hyperlink"/>
+          </w:rPr>
+          <w:t>https://github.com/adafruit/Adafruit-TRRS-Trinkey-PCB</w:t>
+        </w:r>
+      </w:hyperlink>
+      <w:r>
+        <w:t xml:space="preserve">. </w:t>
+      </w:r>
+      <w:r>
+        <w:t xml:space="preserve">It is certified as open hardware with the </w:t>
+      </w:r>
+      <w:proofErr w:type="gramStart"/>
+      <w:r>
+        <w:t>Open Source</w:t>
+      </w:r>
+      <w:proofErr w:type="gramEnd"/>
+      <w:r>
+        <w:t xml:space="preserve"> Hardware Association (OSHWA) as </w:t>
+      </w:r>
+      <w:hyperlink r:id="rId17" w:history="1">
+        <w:r>
+          <w:rPr>
+            <w:rStyle w:val="Hyperlink"/>
+          </w:rPr>
+          <w:t>US002639</w:t>
+        </w:r>
+      </w:hyperlink>
+      <w:r>
+        <w:t>.</w:t>
+      </w:r>
+    </w:p>
+    <w:p>
+      <w:r>
+        <w:t xml:space="preserve">The Shrub Hub is programmed in </w:t>
+      </w:r>
+      <w:hyperlink r:id="rId18" w:history="1">
+        <w:proofErr w:type="spellStart"/>
+        <w:r>
+          <w:rPr>
+            <w:rStyle w:val="Hyperlink"/>
+          </w:rPr>
+          <w:t>CircuitPython</w:t>
+        </w:r>
+        <w:proofErr w:type="spellEnd"/>
+      </w:hyperlink>
+      <w:r>
+        <w:t xml:space="preserve"> </w:t>
+      </w:r>
+      <w:r>
+        <w:t xml:space="preserve">using the </w:t>
+      </w:r>
+      <w:hyperlink r:id="rId19" w:history="1">
+        <w:r>
+          <w:rPr>
+            <w:rStyle w:val="Hyperlink"/>
+          </w:rPr>
+          <w:t>Mu Python Editor</w:t>
+        </w:r>
+      </w:hyperlink>
+      <w:r>
+        <w:t xml:space="preserve"> </w:t>
+      </w:r>
+    </w:p>
+    <w:p>
+      <w:pPr>
+        <w:pStyle w:val="Heading3"/>
+      </w:pPr>
+      <w:r>
+        <w:t>Contributors</w:t>
+      </w:r>
+    </w:p>
+    <w:p>
+      <w:pPr>
+        <w:rPr>
+          <w:b/>
+          <w:bCs/>
+        </w:rPr>
+      </w:pPr>
+      <w:r>
+        <w:rPr>
+          <w:b/>
+          <w:bCs/>
+        </w:rPr>
+        <w:t>Designers:</w:t>
+      </w:r>
+    </w:p>
+    <w:p>
+      <w:pPr>
+        <w:pStyle w:val="ListParagraph"/>
+        <w:numPr>
+          <w:ilvl w:val="0"/>
+          <w:numId w:val="8"/>
+        </w:numPr>
+      </w:pPr>
+      <w:r>
+        <w:t>Shrub Hub:</w:t>
+      </w:r>
+    </w:p>
+    <w:p>
+      <w:pPr>
+        <w:pStyle w:val="ListParagraph"/>
+        <w:numPr>
+          <w:ilvl w:val="1"/>
+          <w:numId w:val="8"/>
+        </w:numPr>
+      </w:pPr>
+      <w:r>
+        <w:t>Brad Wellington, Neil Squire Society / Makers Making Change.</w:t>
+      </w:r>
+    </w:p>
+    <w:p>
+      <w:pPr>
+        <w:pStyle w:val="ListParagraph"/>
+        <w:numPr>
+          <w:ilvl w:val="0"/>
+          <w:numId w:val="8"/>
+        </w:numPr>
+      </w:pPr>
+      <w:r>
+        <w:t>Original TRRS Switch Control Device:</w:t>
+      </w:r>
+    </w:p>
+    <w:p>
+      <w:pPr>
+        <w:pStyle w:val="ListParagraph"/>
+        <w:numPr>
+          <w:ilvl w:val="1"/>
+          <w:numId w:val="8"/>
+        </w:numPr>
+      </w:pPr>
+      <w:r>
+        <w:t>Chris Young</w:t>
+      </w:r>
+    </w:p>
+    <w:p>
+      <w:pPr>
+        <w:pStyle w:val="ListParagraph"/>
+        <w:numPr>
+          <w:ilvl w:val="1"/>
+          <w:numId w:val="8"/>
+        </w:numPr>
+      </w:pPr>
+      <w:r>
+        <w:t>Bill Binko</w:t>
+      </w:r>
+    </w:p>
+    <w:p>
+      <w:pPr>
+        <w:rPr>
+          <w:b/>
+          <w:bCs/>
+        </w:rPr>
+      </w:pPr>
+      <w:r>
+        <w:rPr>
+          <w:b/>
+          <w:bCs/>
+        </w:rPr>
+        <w:lastRenderedPageBreak/>
+        <w:t> Testers</w:t>
+      </w:r>
+      <w:r>
+        <w:rPr>
+          <w:b/>
+          <w:bCs/>
+        </w:rPr>
+        <w:t>:</w:t>
+      </w:r>
+    </w:p>
+    <w:p>
+      <w:pPr>
+        <w:pStyle w:val="ListParagraph"/>
+        <w:numPr>
+          <w:ilvl w:val="0"/>
+          <w:numId w:val="6"/>
+        </w:numPr>
+      </w:pPr>
+      <w:r>
+        <w:t>Jake McIvor, Neil Squire Society / Makers Making Change.</w:t>
+      </w:r>
+    </w:p>
+    <w:p>
+      <w:pPr>
+        <w:pStyle w:val="ListParagraph"/>
+        <w:numPr>
+          <w:ilvl w:val="0"/>
+          <w:numId w:val="6"/>
+        </w:numPr>
+      </w:pPr>
+      <w:r>
+        <w:t>Josie Versloot, Neil Squire Society / Makers Making Change.</w:t>
+      </w:r>
+    </w:p>
+    <w:p>
+      <w:pPr>
+        <w:pStyle w:val="ListParagraph"/>
+        <w:numPr>
+          <w:ilvl w:val="0"/>
+          <w:numId w:val="6"/>
+        </w:numPr>
+      </w:pPr>
+      <w:r>
+        <w:t>Stephan Dobri, Neil Squire Society / Makers Making Change.</w:t>
+      </w:r>
+    </w:p>
+    <w:p>
+      <w:pPr>
+        <w:pStyle w:val="ListParagraph"/>
+        <w:numPr>
+          <w:ilvl w:val="0"/>
+          <w:numId w:val="6"/>
+        </w:numPr>
+      </w:pPr>
+      <w:r>
+        <w:t>Jody Dickerson, Neil Squire Society / Solutions</w:t>
+      </w:r>
+    </w:p>
+    <w:p>
+      <w:pPr>
+        <w:pStyle w:val="ListParagraph"/>
+        <w:numPr>
+          <w:ilvl w:val="0"/>
+          <w:numId w:val="6"/>
+        </w:numPr>
+      </w:pPr>
+      <w:r>
+        <w:t>Eric Chau, Neil Squire Society / Solutions</w:t>
       </w:r>
     </w:p>
     <w:p>
@@ -2516,6 +2940,16 @@
                 <w:lang w:eastAsia="en-CA"/>
               </w:rPr>
             </w:pPr>
+            <w:r>
+              <w:rPr>
+                <w:rFonts w:ascii="Roboto" w:eastAsia="Times New Roman" w:hAnsi="Roboto" w:cs="Times New Roman"/>
+                <w:color w:val="2B2B2B"/>
+                <w:sz w:val="20"/>
+                <w:szCs w:val="20"/>
+                <w:lang w:eastAsia="en-CA"/>
+              </w:rPr>
+              <w:t>X</w:t>
+            </w:r>
           </w:p>
         </w:tc>
         <w:tc>
@@ -2736,21 +3170,46 @@
         <w:rPr>
           <w:lang w:val="en-US"/>
         </w:rPr>
+        <w:t xml:space="preserve">This device is specifically intended to be </w:t>
+      </w:r>
+      <w:r>
+        <w:rPr>
+          <w:lang w:val="en-US"/>
+        </w:rPr>
+        <w:t xml:space="preserve">easy to build. </w:t>
+      </w:r>
+      <w:r>
+        <w:rPr>
+          <w:lang w:val="en-US"/>
+        </w:rPr>
         <w:t>The on</w:t>
       </w:r>
       <w:r>
         <w:rPr>
           <w:lang w:val="en-US"/>
         </w:rPr>
-        <w:t>ly skill needed is being able to download and operate the Arduino IDE</w:t>
-      </w:r>
-    </w:p>
-    <w:p>
-      <w:pPr>
-        <w:rPr>
-          <w:lang w:val="en-US"/>
-        </w:rPr>
-      </w:pPr>
+        <w:t xml:space="preserve">ly skill needed is being able to </w:t>
+      </w:r>
+      <w:proofErr w:type="gramStart"/>
+      <w:r>
+        <w:rPr>
+          <w:lang w:val="en-US"/>
+        </w:rPr>
+        <w:t>3D print</w:t>
+      </w:r>
+      <w:proofErr w:type="gramEnd"/>
+      <w:r>
+        <w:rPr>
+          <w:lang w:val="en-US"/>
+        </w:rPr>
+        <w:t xml:space="preserve"> and drag and drop </w:t>
+      </w:r>
+      <w:r>
+        <w:rPr>
+          <w:lang w:val="en-US"/>
+        </w:rPr>
+        <w:t>files. There is optional customization that can be done if the maker is comfortable with minor software changes.</w:t>
+      </w:r>
     </w:p>
     <w:p>
       <w:pPr>
@@ -3145,6 +3604,9 @@
         <w:t>involves stripping wires and screwing them into a terminal, but the build involves no soldering or custom PCBs</w:t>
       </w:r>
       <w:r>
+        <w:t>.</w:t>
+      </w:r>
+      <w:r>
         <w:t xml:space="preserve"> </w:t>
       </w:r>
     </w:p>
@@ -3161,6 +3623,7 @@
           <w:rFonts w:ascii="Calibri" w:eastAsia="Calibri" w:hAnsi="Calibri" w:cs="Calibri"/>
           <w:lang w:val="en-US"/>
         </w:rPr>
+        <w:lastRenderedPageBreak/>
         <w:t>Download Link</w:t>
       </w:r>
     </w:p>
@@ -3240,6 +3703,8 @@
       </w:pPr>
       <w:r>
         <w:rPr>
+          <w:b/>
+          <w:bCs/>
           <w:lang w:val="en-US"/>
         </w:rPr>
         <w:t>Hardware:</w:t>
@@ -3251,46 +3716,47 @@
         <w:t xml:space="preserve"> </w:t>
       </w:r>
       <w:r>
+        <w:t>CERN-OHL-W v2</w:t>
+      </w:r>
+    </w:p>
+    <w:p>
+      <w:pPr>
+        <w:rPr>
+          <w:lang w:val="en-US"/>
+        </w:rPr>
+      </w:pPr>
+      <w:r>
+        <w:rPr>
+          <w:b/>
+          <w:bCs/>
+          <w:lang w:val="en-US"/>
+        </w:rPr>
+        <w:t>Software:</w:t>
+      </w:r>
+      <w:r>
+        <w:rPr>
+          <w:lang w:val="en-US"/>
+        </w:rPr>
+        <w:t xml:space="preserve"> </w:t>
+      </w:r>
+      <w:r>
+        <w:rPr>
+          <w:lang w:val="en-US"/>
+        </w:rPr>
+        <w:t>GNU General Public License v3.0 (GPL-3.0).</w:t>
+      </w:r>
+    </w:p>
+    <w:p>
+      <w:pPr>
         <w:rPr>
           <w:lang w:val="fr-FR"/>
         </w:rPr>
-        <w:t>CERN-OHL-W v2</w:t>
-      </w:r>
-    </w:p>
-    <w:p>
-      <w:pPr>
-        <w:rPr>
-          <w:lang w:val="en-US"/>
-        </w:rPr>
-      </w:pPr>
-      <w:r>
-        <w:rPr>
-          <w:lang w:val="en-US"/>
-        </w:rPr>
-        <w:t>Software:</w:t>
-      </w:r>
-      <w:r>
-        <w:rPr>
-          <w:lang w:val="en-US"/>
-        </w:rPr>
-        <w:t xml:space="preserve"> </w:t>
-      </w:r>
-      <w:r>
-        <w:rPr>
-          <w:lang w:val="en-US"/>
-        </w:rPr>
-        <w:t xml:space="preserve">MIT License </w:t>
-      </w:r>
-    </w:p>
-    <w:p>
-      <w:pPr>
-        <w:rPr>
-          <w:lang w:val="fr-FR"/>
-        </w:rPr>
       </w:pPr>
       <w:proofErr w:type="gramStart"/>
       <w:r>
         <w:rPr>
+          <w:b/>
+          <w:bCs/>
           <w:lang w:val="fr-FR"/>
         </w:rPr>
         <w:t>Documentation:</w:t>
@@ -3443,7 +3909,15 @@
         <w:sz w:val="16"/>
         <w:szCs w:val="16"/>
       </w:rPr>
-      <w:t>2025</w:t>
+      <w:t>202</w:t>
+    </w:r>
+    <w:r>
+      <w:rPr>
+        <w:color w:val="404040" w:themeColor="text1" w:themeTint="BF"/>
+        <w:sz w:val="16"/>
+        <w:szCs w:val="16"/>
+      </w:rPr>
+      <w:t>6</w:t>
     </w:r>
     <w:r>
       <w:rPr>
@@ -3823,7 +4297,7 @@
               <v:stroke joinstyle="miter"/>
               <v:path gradientshapeok="t" o:connecttype="rect"/>
             </v:shapetype>
-            <v:shape id="Text Box 2" o:spid="_x0000_s1026" type="#_x0000_t202" style="position:absolute;margin-left:92.8pt;margin-top:.6pt;width:2in;height:49.5pt;z-index:251659264;visibility:visible;mso-wrap-style:square;mso-width-percent:0;mso-height-percent:0;mso-wrap-distance-left:9pt;mso-wrap-distance-top:3.6pt;mso-wrap-distance-right:9pt;mso-wrap-distance-bottom:3.6pt;mso-position-horizontal:right;mso-position-horizontal-relative:margin;mso-position-vertical:absolute;mso-position-vertical-relative:text;mso-width-percent:0;mso-height-percent:0;mso-width-relative:margin;mso-height-relative:margin;v-text-anchor:top" o:gfxdata="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" filled="f" stroked="f">
+            <v:shape id="Text Box 2" o:spid="_x0000_s1026" type="#_x0000_t202" style="position:absolute;margin-left:92.8pt;margin-top:.6pt;width:2in;height:49.5pt;z-index:251658240;visibility:visible;mso-wrap-style:square;mso-width-percent:0;mso-height-percent:0;mso-wrap-distance-left:9pt;mso-wrap-distance-top:3.6pt;mso-wrap-distance-right:9pt;mso-wrap-distance-bottom:3.6pt;mso-position-horizontal:right;mso-position-horizontal-relative:margin;mso-position-vertical:absolute;mso-position-vertical-relative:text;mso-width-percent:0;mso-height-percent:0;mso-width-relative:margin;mso-height-relative:margin;v-text-anchor:top" o:gfxdata="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" filled="f" stroked="f">
               <v:textbox>
                 <w:txbxContent>
                   <w:p>
@@ -3854,7 +4328,7 @@
                                   </pic:cNvPicPr>
                                 </pic:nvPicPr>
                                 <pic:blipFill>
-                                  <a:blip r:embed="rId2">
+                                  <a:blip r:embed="rId1">
                                     <a:extLst>
                                       <a:ext uri="{28A0092B-C50C-407E-A947-70E740481C1C}">
                                         <a14:useLocalDpi xmlns:a14="http://schemas.microsoft.com/office/drawing/2010/main" val="0"/>
@@ -3932,7 +4406,37 @@
         <w:sz w:val="16"/>
         <w:szCs w:val="16"/>
       </w:rPr>
-      <w:t>July 2025</w:t>
+      <w:t>J</w:t>
+    </w:r>
+    <w:r>
+      <w:rPr>
+        <w:b/>
+        <w:bCs/>
+        <w:color w:val="646464"/>
+        <w:sz w:val="16"/>
+        <w:szCs w:val="16"/>
+      </w:rPr>
+      <w:t>anuary</w:t>
+    </w:r>
+    <w:r>
+      <w:rPr>
+        <w:b/>
+        <w:bCs/>
+        <w:color w:val="646464"/>
+        <w:sz w:val="16"/>
+        <w:szCs w:val="16"/>
+      </w:rPr>
+      <w:t xml:space="preserve"> 202</w:t>
+    </w:r>
+    <w:r>
+      <w:rPr>
+        <w:b/>
+        <w:bCs/>
+        <w:color w:val="646464"/>
+        <w:sz w:val="16"/>
+        <w:szCs w:val="16"/>
+      </w:rPr>
+      <w:t>6</w:t>
     </w:r>
   </w:p>
   <w:p>
@@ -4398,6 +4902,230 @@
     </w:lvl>
   </w:abstractNum>
   <w:abstractNum w:abstractNumId="3" w15:restartNumberingAfterBreak="0">
+    <w:nsid w:val="60FE4791"/>
+    <w:multiLevelType w:val="hybridMultilevel"/>
+    <w:tmpl w:val="AB0421FE"/>
+    <w:lvl w:ilvl="0" w:tplc="5A20FBE4">
+      <w:numFmt w:val="bullet"/>
+      <w:lvlText w:val="-"/>
+      <w:lvlJc w:val="left"/>
+      <w:pPr>
+        <w:ind w:left="405" w:hanging="360"/>
+      </w:pPr>
+      <w:rPr>
+        <w:rFonts w:ascii="Calibri" w:eastAsiaTheme="minorEastAsia" w:hAnsi="Calibri" w:cs="Calibri" w:hint="default"/>
+      </w:rPr>
+    </w:lvl>
+    <w:lvl w:ilvl="1" w:tplc="10090003">
+      <w:start w:val="1"/>
+      <w:numFmt w:val="bullet"/>
+      <w:lvlText w:val="o"/>
+      <w:lvlJc w:val="left"/>
+      <w:pPr>
+        <w:ind w:left="1125" w:hanging="360"/>
+      </w:pPr>
+      <w:rPr>
+        <w:rFonts w:ascii="Courier New" w:hAnsi="Courier New" w:cs="Courier New" w:hint="default"/>
+      </w:rPr>
+    </w:lvl>
+    <w:lvl w:ilvl="2" w:tplc="10090005" w:tentative="1">
+      <w:start w:val="1"/>
+      <w:numFmt w:val="bullet"/>
+      <w:lvlText w:val=""/>
+      <w:lvlJc w:val="left"/>
+      <w:pPr>
+        <w:ind w:left="1845" w:hanging="360"/>
+      </w:pPr>
+      <w:rPr>
+        <w:rFonts w:ascii="Wingdings" w:hAnsi="Wingdings" w:hint="default"/>
+      </w:rPr>
+    </w:lvl>
+    <w:lvl w:ilvl="3" w:tplc="10090001" w:tentative="1">
+      <w:start w:val="1"/>
+      <w:numFmt w:val="bullet"/>
+      <w:lvlText w:val=""/>
+      <w:lvlJc w:val="left"/>
+      <w:pPr>
+        <w:ind w:left="2565" w:hanging="360"/>
+      </w:pPr>
+      <w:rPr>
+        <w:rFonts w:ascii="Symbol" w:hAnsi="Symbol" w:hint="default"/>
+      </w:rPr>
+    </w:lvl>
+    <w:lvl w:ilvl="4" w:tplc="10090003" w:tentative="1">
+      <w:start w:val="1"/>
+      <w:numFmt w:val="bullet"/>
+      <w:lvlText w:val="o"/>
+      <w:lvlJc w:val="left"/>
+      <w:pPr>
+        <w:ind w:left="3285" w:hanging="360"/>
+      </w:pPr>
+      <w:rPr>
+        <w:rFonts w:ascii="Courier New" w:hAnsi="Courier New" w:cs="Courier New" w:hint="default"/>
+      </w:rPr>
+    </w:lvl>
+    <w:lvl w:ilvl="5" w:tplc="10090005" w:tentative="1">
+      <w:start w:val="1"/>
+      <w:numFmt w:val="bullet"/>
+      <w:lvlText w:val=""/>
+      <w:lvlJc w:val="left"/>
+      <w:pPr>
+        <w:ind w:left="4005" w:hanging="360"/>
+      </w:pPr>
+      <w:rPr>
+        <w:rFonts w:ascii="Wingdings" w:hAnsi="Wingdings" w:hint="default"/>
+      </w:rPr>
+    </w:lvl>
+    <w:lvl w:ilvl="6" w:tplc="10090001" w:tentative="1">
+      <w:start w:val="1"/>
+      <w:numFmt w:val="bullet"/>
+      <w:lvlText w:val=""/>
+      <w:lvlJc w:val="left"/>
+      <w:pPr>
+        <w:ind w:left="4725" w:hanging="360"/>
+      </w:pPr>
+      <w:rPr>
+        <w:rFonts w:ascii="Symbol" w:hAnsi="Symbol" w:hint="default"/>
+      </w:rPr>
+    </w:lvl>
+    <w:lvl w:ilvl="7" w:tplc="10090003" w:tentative="1">
+      <w:start w:val="1"/>
+      <w:numFmt w:val="bullet"/>
+      <w:lvlText w:val="o"/>
+      <w:lvlJc w:val="left"/>
+      <w:pPr>
+        <w:ind w:left="5445" w:hanging="360"/>
+      </w:pPr>
+      <w:rPr>
+        <w:rFonts w:ascii="Courier New" w:hAnsi="Courier New" w:cs="Courier New" w:hint="default"/>
+      </w:rPr>
+    </w:lvl>
+    <w:lvl w:ilvl="8" w:tplc="10090005" w:tentative="1">
+      <w:start w:val="1"/>
+      <w:numFmt w:val="bullet"/>
+      <w:lvlText w:val=""/>
+      <w:lvlJc w:val="left"/>
+      <w:pPr>
+        <w:ind w:left="6165" w:hanging="360"/>
+      </w:pPr>
+      <w:rPr>
+        <w:rFonts w:ascii="Wingdings" w:hAnsi="Wingdings" w:hint="default"/>
+      </w:rPr>
+    </w:lvl>
+  </w:abstractNum>
+  <w:abstractNum w:abstractNumId="4" w15:restartNumberingAfterBreak="0">
+    <w:nsid w:val="703A39C1"/>
+    <w:multiLevelType w:val="hybridMultilevel"/>
+    <w:tmpl w:val="07906124"/>
+    <w:lvl w:ilvl="0" w:tplc="5A20FBE4">
+      <w:numFmt w:val="bullet"/>
+      <w:lvlText w:val="-"/>
+      <w:lvlJc w:val="left"/>
+      <w:pPr>
+        <w:ind w:left="405" w:hanging="360"/>
+      </w:pPr>
+      <w:rPr>
+        <w:rFonts w:ascii="Calibri" w:eastAsiaTheme="minorEastAsia" w:hAnsi="Calibri" w:cs="Calibri" w:hint="default"/>
+      </w:rPr>
+    </w:lvl>
+    <w:lvl w:ilvl="1" w:tplc="10090003" w:tentative="1">
+      <w:start w:val="1"/>
+      <w:numFmt w:val="bullet"/>
+      <w:lvlText w:val="o"/>
+      <w:lvlJc w:val="left"/>
+      <w:pPr>
+        <w:ind w:left="1125" w:hanging="360"/>
+      </w:pPr>
+      <w:rPr>
+        <w:rFonts w:ascii="Courier New" w:hAnsi="Courier New" w:cs="Courier New" w:hint="default"/>
+      </w:rPr>
+    </w:lvl>
+    <w:lvl w:ilvl="2" w:tplc="10090005" w:tentative="1">
+      <w:start w:val="1"/>
+      <w:numFmt w:val="bullet"/>
+      <w:lvlText w:val=""/>
+      <w:lvlJc w:val="left"/>
+      <w:pPr>
+        <w:ind w:left="1845" w:hanging="360"/>
+      </w:pPr>
+      <w:rPr>
+        <w:rFonts w:ascii="Wingdings" w:hAnsi="Wingdings" w:hint="default"/>
+      </w:rPr>
+    </w:lvl>
+    <w:lvl w:ilvl="3" w:tplc="10090001" w:tentative="1">
+      <w:start w:val="1"/>
+      <w:numFmt w:val="bullet"/>
+      <w:lvlText w:val=""/>
+      <w:lvlJc w:val="left"/>
+      <w:pPr>
+        <w:ind w:left="2565" w:hanging="360"/>
+      </w:pPr>
+      <w:rPr>
+        <w:rFonts w:ascii="Symbol" w:hAnsi="Symbol" w:hint="default"/>
+      </w:rPr>
+    </w:lvl>
+    <w:lvl w:ilvl="4" w:tplc="10090003" w:tentative="1">
+      <w:start w:val="1"/>
+      <w:numFmt w:val="bullet"/>
+      <w:lvlText w:val="o"/>
+      <w:lvlJc w:val="left"/>
+      <w:pPr>
+        <w:ind w:left="3285" w:hanging="360"/>
+      </w:pPr>
+      <w:rPr>
+        <w:rFonts w:ascii="Courier New" w:hAnsi="Courier New" w:cs="Courier New" w:hint="default"/>
+      </w:rPr>
+    </w:lvl>
+    <w:lvl w:ilvl="5" w:tplc="10090005" w:tentative="1">
+      <w:start w:val="1"/>
+      <w:numFmt w:val="bullet"/>
+      <w:lvlText w:val=""/>
+      <w:lvlJc w:val="left"/>
+      <w:pPr>
+        <w:ind w:left="4005" w:hanging="360"/>
+      </w:pPr>
+      <w:rPr>
+        <w:rFonts w:ascii="Wingdings" w:hAnsi="Wingdings" w:hint="default"/>
+      </w:rPr>
+    </w:lvl>
+    <w:lvl w:ilvl="6" w:tplc="10090001" w:tentative="1">
+      <w:start w:val="1"/>
+      <w:numFmt w:val="bullet"/>
+      <w:lvlText w:val=""/>
+      <w:lvlJc w:val="left"/>
+      <w:pPr>
+        <w:ind w:left="4725" w:hanging="360"/>
+      </w:pPr>
+      <w:rPr>
+        <w:rFonts w:ascii="Symbol" w:hAnsi="Symbol" w:hint="default"/>
+      </w:rPr>
+    </w:lvl>
+    <w:lvl w:ilvl="7" w:tplc="10090003" w:tentative="1">
+      <w:start w:val="1"/>
+      <w:numFmt w:val="bullet"/>
+      <w:lvlText w:val="o"/>
+      <w:lvlJc w:val="left"/>
+      <w:pPr>
+        <w:ind w:left="5445" w:hanging="360"/>
+      </w:pPr>
+      <w:rPr>
+        <w:rFonts w:ascii="Courier New" w:hAnsi="Courier New" w:cs="Courier New" w:hint="default"/>
+      </w:rPr>
+    </w:lvl>
+    <w:lvl w:ilvl="8" w:tplc="10090005" w:tentative="1">
+      <w:start w:val="1"/>
+      <w:numFmt w:val="bullet"/>
+      <w:lvlText w:val=""/>
+      <w:lvlJc w:val="left"/>
+      <w:pPr>
+        <w:ind w:left="6165" w:hanging="360"/>
+      </w:pPr>
+      <w:rPr>
+        <w:rFonts w:ascii="Wingdings" w:hAnsi="Wingdings" w:hint="default"/>
+      </w:rPr>
+    </w:lvl>
+  </w:abstractNum>
+  <w:abstractNum w:abstractNumId="5" w15:restartNumberingAfterBreak="0">
     <w:nsid w:val="7C7606DE"/>
     <w:multiLevelType w:val="multilevel"/>
     <w:tmpl w:val="3370BF58"/>
@@ -4535,6 +5263,231 @@
       <w:rPr>
         <w:rFonts w:ascii="Wingdings" w:hAnsi="Wingdings" w:hint="default"/>
         <w:sz w:val="20"/>
+      </w:rPr>
+    </w:lvl>
+  </w:abstractNum>
+  <w:abstractNum w:abstractNumId="6" w15:restartNumberingAfterBreak="0">
+    <w:nsid w:val="7C896865"/>
+    <w:multiLevelType w:val="hybridMultilevel"/>
+    <w:tmpl w:val="791EDFD8"/>
+    <w:lvl w:ilvl="0" w:tplc="5A20FBE4">
+      <w:numFmt w:val="bullet"/>
+      <w:lvlText w:val="-"/>
+      <w:lvlJc w:val="left"/>
+      <w:pPr>
+        <w:ind w:left="405" w:hanging="360"/>
+      </w:pPr>
+      <w:rPr>
+        <w:rFonts w:ascii="Calibri" w:eastAsiaTheme="minorEastAsia" w:hAnsi="Calibri" w:cs="Calibri" w:hint="default"/>
+      </w:rPr>
+    </w:lvl>
+    <w:lvl w:ilvl="1" w:tplc="10090003" w:tentative="1">
+      <w:start w:val="1"/>
+      <w:numFmt w:val="bullet"/>
+      <w:lvlText w:val="o"/>
+      <w:lvlJc w:val="left"/>
+      <w:pPr>
+        <w:ind w:left="1440" w:hanging="360"/>
+      </w:pPr>
+      <w:rPr>
+        <w:rFonts w:ascii="Courier New" w:hAnsi="Courier New" w:cs="Courier New" w:hint="default"/>
+      </w:rPr>
+    </w:lvl>
+    <w:lvl w:ilvl="2" w:tplc="10090005" w:tentative="1">
+      <w:start w:val="1"/>
+      <w:numFmt w:val="bullet"/>
+      <w:lvlText w:val=""/>
+      <w:lvlJc w:val="left"/>
+      <w:pPr>
+        <w:ind w:left="2160" w:hanging="360"/>
+      </w:pPr>
+      <w:rPr>
+        <w:rFonts w:ascii="Wingdings" w:hAnsi="Wingdings" w:hint="default"/>
+      </w:rPr>
+    </w:lvl>
+    <w:lvl w:ilvl="3" w:tplc="10090001" w:tentative="1">
+      <w:start w:val="1"/>
+      <w:numFmt w:val="bullet"/>
+      <w:lvlText w:val=""/>
+      <w:lvlJc w:val="left"/>
+      <w:pPr>
+        <w:ind w:left="2880" w:hanging="360"/>
+      </w:pPr>
+      <w:rPr>
+        <w:rFonts w:ascii="Symbol" w:hAnsi="Symbol" w:hint="default"/>
+      </w:rPr>
+    </w:lvl>
+    <w:lvl w:ilvl="4" w:tplc="10090003" w:tentative="1">
+      <w:start w:val="1"/>
+      <w:numFmt w:val="bullet"/>
+      <w:lvlText w:val="o"/>
+      <w:lvlJc w:val="left"/>
+      <w:pPr>
+        <w:ind w:left="3600" w:hanging="360"/>
+      </w:pPr>
+      <w:rPr>
+        <w:rFonts w:ascii="Courier New" w:hAnsi="Courier New" w:cs="Courier New" w:hint="default"/>
+      </w:rPr>
+    </w:lvl>
+    <w:lvl w:ilvl="5" w:tplc="10090005" w:tentative="1">
+      <w:start w:val="1"/>
+      <w:numFmt w:val="bullet"/>
+      <w:lvlText w:val=""/>
+      <w:lvlJc w:val="left"/>
+      <w:pPr>
+        <w:ind w:left="4320" w:hanging="360"/>
+      </w:pPr>
+      <w:rPr>
+        <w:rFonts w:ascii="Wingdings" w:hAnsi="Wingdings" w:hint="default"/>
+      </w:rPr>
+    </w:lvl>
+    <w:lvl w:ilvl="6" w:tplc="10090001" w:tentative="1">
+      <w:start w:val="1"/>
+      <w:numFmt w:val="bullet"/>
+      <w:lvlText w:val=""/>
+      <w:lvlJc w:val="left"/>
+      <w:pPr>
+        <w:ind w:left="5040" w:hanging="360"/>
+      </w:pPr>
+      <w:rPr>
+        <w:rFonts w:ascii="Symbol" w:hAnsi="Symbol" w:hint="default"/>
+      </w:rPr>
+    </w:lvl>
+    <w:lvl w:ilvl="7" w:tplc="10090003" w:tentative="1">
+      <w:start w:val="1"/>
+      <w:numFmt w:val="bullet"/>
+      <w:lvlText w:val="o"/>
+      <w:lvlJc w:val="left"/>
+      <w:pPr>
+        <w:ind w:left="5760" w:hanging="360"/>
+      </w:pPr>
+      <w:rPr>
+        <w:rFonts w:ascii="Courier New" w:hAnsi="Courier New" w:cs="Courier New" w:hint="default"/>
+      </w:rPr>
+    </w:lvl>
+    <w:lvl w:ilvl="8" w:tplc="10090005" w:tentative="1">
+      <w:start w:val="1"/>
+      <w:numFmt w:val="bullet"/>
+      <w:lvlText w:val=""/>
+      <w:lvlJc w:val="left"/>
+      <w:pPr>
+        <w:ind w:left="6480" w:hanging="360"/>
+      </w:pPr>
+      <w:rPr>
+        <w:rFonts w:ascii="Wingdings" w:hAnsi="Wingdings" w:hint="default"/>
+      </w:rPr>
+    </w:lvl>
+  </w:abstractNum>
+  <w:abstractNum w:abstractNumId="7" w15:restartNumberingAfterBreak="0">
+    <w:nsid w:val="7D5E4018"/>
+    <w:multiLevelType w:val="hybridMultilevel"/>
+    <w:tmpl w:val="27DECED2"/>
+    <w:lvl w:ilvl="0" w:tplc="10090001">
+      <w:start w:val="1"/>
+      <w:numFmt w:val="bullet"/>
+      <w:lvlText w:val=""/>
+      <w:lvlJc w:val="left"/>
+      <w:pPr>
+        <w:ind w:left="720" w:hanging="360"/>
+      </w:pPr>
+      <w:rPr>
+        <w:rFonts w:ascii="Symbol" w:hAnsi="Symbol" w:hint="default"/>
+      </w:rPr>
+    </w:lvl>
+    <w:lvl w:ilvl="1" w:tplc="10090003" w:tentative="1">
+      <w:start w:val="1"/>
+      <w:numFmt w:val="bullet"/>
+      <w:lvlText w:val="o"/>
+      <w:lvlJc w:val="left"/>
+      <w:pPr>
+        <w:ind w:left="1440" w:hanging="360"/>
+      </w:pPr>
+      <w:rPr>
+        <w:rFonts w:ascii="Courier New" w:hAnsi="Courier New" w:cs="Courier New" w:hint="default"/>
+      </w:rPr>
+    </w:lvl>
+    <w:lvl w:ilvl="2" w:tplc="10090005" w:tentative="1">
+      <w:start w:val="1"/>
+      <w:numFmt w:val="bullet"/>
+      <w:lvlText w:val=""/>
+      <w:lvlJc w:val="left"/>
+      <w:pPr>
+        <w:ind w:left="2160" w:hanging="360"/>
+      </w:pPr>
+      <w:rPr>
+        <w:rFonts w:ascii="Wingdings" w:hAnsi="Wingdings" w:hint="default"/>
+      </w:rPr>
+    </w:lvl>
+    <w:lvl w:ilvl="3" w:tplc="10090001" w:tentative="1">
+      <w:start w:val="1"/>
+      <w:numFmt w:val="bullet"/>
+      <w:lvlText w:val=""/>
+      <w:lvlJc w:val="left"/>
+      <w:pPr>
+        <w:ind w:left="2880" w:hanging="360"/>
+      </w:pPr>
+      <w:rPr>
+        <w:rFonts w:ascii="Symbol" w:hAnsi="Symbol" w:hint="default"/>
+      </w:rPr>
+    </w:lvl>
+    <w:lvl w:ilvl="4" w:tplc="10090003" w:tentative="1">
+      <w:start w:val="1"/>
+      <w:numFmt w:val="bullet"/>
+      <w:lvlText w:val="o"/>
+      <w:lvlJc w:val="left"/>
+      <w:pPr>
+        <w:ind w:left="3600" w:hanging="360"/>
+      </w:pPr>
+      <w:rPr>
+        <w:rFonts w:ascii="Courier New" w:hAnsi="Courier New" w:cs="Courier New" w:hint="default"/>
+      </w:rPr>
+    </w:lvl>
+    <w:lvl w:ilvl="5" w:tplc="10090005" w:tentative="1">
+      <w:start w:val="1"/>
+      <w:numFmt w:val="bullet"/>
+      <w:lvlText w:val=""/>
+      <w:lvlJc w:val="left"/>
+      <w:pPr>
+        <w:ind w:left="4320" w:hanging="360"/>
+      </w:pPr>
+      <w:rPr>
+        <w:rFonts w:ascii="Wingdings" w:hAnsi="Wingdings" w:hint="default"/>
+      </w:rPr>
+    </w:lvl>
+    <w:lvl w:ilvl="6" w:tplc="10090001" w:tentative="1">
+      <w:start w:val="1"/>
+      <w:numFmt w:val="bullet"/>
+      <w:lvlText w:val=""/>
+      <w:lvlJc w:val="left"/>
+      <w:pPr>
+        <w:ind w:left="5040" w:hanging="360"/>
+      </w:pPr>
+      <w:rPr>
+        <w:rFonts w:ascii="Symbol" w:hAnsi="Symbol" w:hint="default"/>
+      </w:rPr>
+    </w:lvl>
+    <w:lvl w:ilvl="7" w:tplc="10090003" w:tentative="1">
+      <w:start w:val="1"/>
+      <w:numFmt w:val="bullet"/>
+      <w:lvlText w:val="o"/>
+      <w:lvlJc w:val="left"/>
+      <w:pPr>
+        <w:ind w:left="5760" w:hanging="360"/>
+      </w:pPr>
+      <w:rPr>
+        <w:rFonts w:ascii="Courier New" w:hAnsi="Courier New" w:cs="Courier New" w:hint="default"/>
+      </w:rPr>
+    </w:lvl>
+    <w:lvl w:ilvl="8" w:tplc="10090005" w:tentative="1">
+      <w:start w:val="1"/>
+      <w:numFmt w:val="bullet"/>
+      <w:lvlText w:val=""/>
+      <w:lvlJc w:val="left"/>
+      <w:pPr>
+        <w:ind w:left="6480" w:hanging="360"/>
+      </w:pPr>
+      <w:rPr>
+        <w:rFonts w:ascii="Wingdings" w:hAnsi="Wingdings" w:hint="default"/>
       </w:rPr>
     </w:lvl>
   </w:abstractNum>
@@ -4545,10 +5498,22 @@
     <w:abstractNumId w:val="2"/>
   </w:num>
   <w:num w:numId="3" w16cid:durableId="1951890145">
-    <w:abstractNumId w:val="3"/>
+    <w:abstractNumId w:val="5"/>
   </w:num>
   <w:num w:numId="4" w16cid:durableId="93207428">
     <w:abstractNumId w:val="0"/>
+  </w:num>
+  <w:num w:numId="5" w16cid:durableId="194464298">
+    <w:abstractNumId w:val="7"/>
+  </w:num>
+  <w:num w:numId="6" w16cid:durableId="70465720">
+    <w:abstractNumId w:val="4"/>
+  </w:num>
+  <w:num w:numId="7" w16cid:durableId="991061251">
+    <w:abstractNumId w:val="6"/>
+  </w:num>
+  <w:num w:numId="8" w16cid:durableId="11150787">
+    <w:abstractNumId w:val="3"/>
   </w:num>
 </w:numbering>
 </file>
@@ -5165,6 +6130,7 @@
   <w:style w:type="character" w:default="1" w:styleId="DefaultParagraphFont">
     <w:name w:val="Default Paragraph Font"/>
     <w:uiPriority w:val="1"/>
+    <w:semiHidden/>
     <w:unhideWhenUsed/>
   </w:style>
   <w:style w:type="table" w:default="1" w:styleId="TableNormal">
@@ -5768,6 +6734,28 @@
       <w:szCs w:val="20"/>
     </w:rPr>
   </w:style>
+  <w:style w:type="paragraph" w:styleId="Revision">
+    <w:name w:val="Revision"/>
+    <w:hidden/>
+    <w:uiPriority w:val="99"/>
+    <w:semiHidden/>
+    <w:rsid w:val="00653511"/>
+    <w:pPr>
+      <w:spacing w:after="0" w:line="240" w:lineRule="auto"/>
+    </w:pPr>
+  </w:style>
+  <w:style w:type="character" w:styleId="FollowedHyperlink">
+    <w:name w:val="FollowedHyperlink"/>
+    <w:basedOn w:val="DefaultParagraphFont"/>
+    <w:uiPriority w:val="99"/>
+    <w:semiHidden/>
+    <w:unhideWhenUsed/>
+    <w:rsid w:val="00CC2929"/>
+    <w:rPr>
+      <w:color w:val="954F72" w:themeColor="followedHyperlink"/>
+      <w:u w:val="single"/>
+    </w:rPr>
+  </w:style>
 </w:styles>
 </file>
 
@@ -6033,8 +7021,28 @@
 </file>
 
 <file path=customXml/item1.xml><?xml version="1.0" encoding="utf-8"?>
-<ct:contentTypeSchema xmlns:ct="http://schemas.microsoft.com/office/2006/metadata/contentType" xmlns:ma="http://schemas.microsoft.com/office/2006/metadata/properties/metaAttributes" ct:_="" ma:_="" ma:contentTypeName="Document" ma:contentTypeID="0x010100B51EC7ECFAC78D4E8EF6CBAFFF0B3505" ma:contentTypeVersion="19" ma:contentTypeDescription="Create a new document." ma:contentTypeScope="" ma:versionID="1619f065ca3ee2b2a551d697af78a52c">
-  <xsd:schema xmlns:xsd="http://www.w3.org/2001/XMLSchema" xmlns:xs="http://www.w3.org/2001/XMLSchema" xmlns:p="http://schemas.microsoft.com/office/2006/metadata/properties" xmlns:ns2="cf9f6c1f-8ad0-4eb8-bb2b-fb0b622a341e" xmlns:ns3="72c39c84-b0a3-45a2-a38c-ff46bb47f11f" targetNamespace="http://schemas.microsoft.com/office/2006/metadata/properties" ma:root="true" ma:fieldsID="f162289ff582f7dcdaca5148f0118a53" ns2:_="" ns3:_="">
+<p:properties xmlns:p="http://schemas.microsoft.com/office/2006/metadata/properties" xmlns:xsi="http://www.w3.org/2001/XMLSchema-instance" xmlns:pc="http://schemas.microsoft.com/office/infopath/2007/PartnerControls">
+  <documentManagement>
+    <TaxCatchAll xmlns="72c39c84-b0a3-45a2-a38c-ff46bb47f11f" xsi:nil="true"/>
+    <lcf76f155ced4ddcb4097134ff3c332f xmlns="cf9f6c1f-8ad0-4eb8-bb2b-fb0b622a341e">
+      <Terms xmlns="http://schemas.microsoft.com/office/infopath/2007/PartnerControls"/>
+    </lcf76f155ced4ddcb4097134ff3c332f>
+  </documentManagement>
+</p:properties>
+</file>
+
+<file path=customXml/item2.xml><?xml version="1.0" encoding="utf-8"?>
+<?mso-contentType ?>
+<FormTemplates xmlns="http://schemas.microsoft.com/sharepoint/v3/contenttype/forms">
+  <Display>DocumentLibraryForm</Display>
+  <Edit>DocumentLibraryForm</Edit>
+  <New>DocumentLibraryForm</New>
+</FormTemplates>
+</file>
+
+<file path=customXml/item3.xml><?xml version="1.0" encoding="utf-8"?>
+<ct:contentTypeSchema xmlns:ct="http://schemas.microsoft.com/office/2006/metadata/contentType" xmlns:ma="http://schemas.microsoft.com/office/2006/metadata/properties/metaAttributes" ct:_="" ma:_="" ma:contentTypeName="Document" ma:contentTypeID="0x010100B51EC7ECFAC78D4E8EF6CBAFFF0B3505" ma:contentTypeVersion="19" ma:contentTypeDescription="Create a new document." ma:contentTypeScope="" ma:versionID="5d9401e09799b0dc5f93c06ba9768007">
+  <xsd:schema xmlns:xsd="http://www.w3.org/2001/XMLSchema" xmlns:xs="http://www.w3.org/2001/XMLSchema" xmlns:p="http://schemas.microsoft.com/office/2006/metadata/properties" xmlns:ns2="cf9f6c1f-8ad0-4eb8-bb2b-fb0b622a341e" xmlns:ns3="72c39c84-b0a3-45a2-a38c-ff46bb47f11f" targetNamespace="http://schemas.microsoft.com/office/2006/metadata/properties" ma:root="true" ma:fieldsID="70cec36318042db763ca353140da6103" ns2:_="" ns3:_="">
     <xsd:import namespace="cf9f6c1f-8ad0-4eb8-bb2b-fb0b622a341e"/>
     <xsd:import namespace="72c39c84-b0a3-45a2-a38c-ff46bb47f11f"/>
     <xsd:element name="properties">
@@ -6287,32 +7295,31 @@
 </ct:contentTypeSchema>
 </file>
 
-<file path=customXml/item2.xml><?xml version="1.0" encoding="utf-8"?>
+<file path=customXml/item4.xml><?xml version="1.0" encoding="utf-8"?>
 <b:Sources xmlns:b="http://schemas.openxmlformats.org/officeDocument/2006/bibliography" xmlns="http://schemas.openxmlformats.org/officeDocument/2006/bibliography" SelectedStyle="\APASixthEditionOfficeOnline.xsl" StyleName="APA" Version="6"/>
 </file>
 
-<file path=customXml/item3.xml><?xml version="1.0" encoding="utf-8"?>
-<?mso-contentType ?>
-<FormTemplates xmlns="http://schemas.microsoft.com/sharepoint/v3/contenttype/forms">
-  <Display>DocumentLibraryForm</Display>
-  <Edit>DocumentLibraryForm</Edit>
-  <New>DocumentLibraryForm</New>
-</FormTemplates>
+<file path=customXml/itemProps1.xml><?xml version="1.0" encoding="utf-8"?>
+<ds:datastoreItem xmlns:ds="http://schemas.openxmlformats.org/officeDocument/2006/customXml" ds:itemID="{409E795B-55BB-4B09-A4AF-7E3EFD40BF53}">
+  <ds:schemaRefs>
+    <ds:schemaRef ds:uri="http://schemas.microsoft.com/office/2006/metadata/properties"/>
+    <ds:schemaRef ds:uri="http://schemas.microsoft.com/office/infopath/2007/PartnerControls"/>
+    <ds:schemaRef ds:uri="72c39c84-b0a3-45a2-a38c-ff46bb47f11f"/>
+    <ds:schemaRef ds:uri="cf9f6c1f-8ad0-4eb8-bb2b-fb0b622a341e"/>
+  </ds:schemaRefs>
+</ds:datastoreItem>
 </file>
 
-<file path=customXml/item4.xml><?xml version="1.0" encoding="utf-8"?>
-<p:properties xmlns:p="http://schemas.microsoft.com/office/2006/metadata/properties" xmlns:xsi="http://www.w3.org/2001/XMLSchema-instance" xmlns:pc="http://schemas.microsoft.com/office/infopath/2007/PartnerControls">
-  <documentManagement>
-    <TaxCatchAll xmlns="72c39c84-b0a3-45a2-a38c-ff46bb47f11f" xsi:nil="true"/>
-    <lcf76f155ced4ddcb4097134ff3c332f xmlns="cf9f6c1f-8ad0-4eb8-bb2b-fb0b622a341e">
-      <Terms xmlns="http://schemas.microsoft.com/office/infopath/2007/PartnerControls"/>
-    </lcf76f155ced4ddcb4097134ff3c332f>
-  </documentManagement>
-</p:properties>
+<file path=customXml/itemProps2.xml><?xml version="1.0" encoding="utf-8"?>
+<ds:datastoreItem xmlns:ds="http://schemas.openxmlformats.org/officeDocument/2006/customXml" ds:itemID="{59E580A2-900E-49E4-BB8B-6C56BD0896DA}">
+  <ds:schemaRefs>
+    <ds:schemaRef ds:uri="http://schemas.microsoft.com/sharepoint/v3/contenttype/forms"/>
+  </ds:schemaRefs>
+</ds:datastoreItem>
 </file>
 
-<file path=customXml/itemProps1.xml><?xml version="1.0" encoding="utf-8"?>
-<ds:datastoreItem xmlns:ds="http://schemas.openxmlformats.org/officeDocument/2006/customXml" ds:itemID="{E440E970-6B79-44CD-B0B3-D94F4A842371}">
+<file path=customXml/itemProps3.xml><?xml version="1.0" encoding="utf-8"?>
+<ds:datastoreItem xmlns:ds="http://schemas.openxmlformats.org/officeDocument/2006/customXml" ds:itemID="{7A6793F5-2500-4054-955F-6A7AAB57DF5A}">
   <ds:schemaRefs>
     <ds:schemaRef ds:uri="http://schemas.microsoft.com/office/2006/metadata/contentType"/>
     <ds:schemaRef ds:uri="http://schemas.microsoft.com/office/2006/metadata/properties/metaAttributes"/>
@@ -6330,29 +7337,10 @@
 </ds:datastoreItem>
 </file>
 
-<file path=customXml/itemProps2.xml><?xml version="1.0" encoding="utf-8"?>
+<file path=customXml/itemProps4.xml><?xml version="1.0" encoding="utf-8"?>
 <ds:datastoreItem xmlns:ds="http://schemas.openxmlformats.org/officeDocument/2006/customXml" ds:itemID="{5490CF3F-A64E-4B68-BE9F-6B8BA2E9C457}">
   <ds:schemaRefs>
     <ds:schemaRef ds:uri="http://schemas.openxmlformats.org/officeDocument/2006/bibliography"/>
   </ds:schemaRefs>
 </ds:datastoreItem>
-</file>
-
-<file path=customXml/itemProps3.xml><?xml version="1.0" encoding="utf-8"?>
-<ds:datastoreItem xmlns:ds="http://schemas.openxmlformats.org/officeDocument/2006/customXml" ds:itemID="{59E580A2-900E-49E4-BB8B-6C56BD0896DA}">
-  <ds:schemaRefs>
-    <ds:schemaRef ds:uri="http://schemas.microsoft.com/sharepoint/v3/contenttype/forms"/>
-  </ds:schemaRefs>
-</ds:datastoreItem>
-</file>
-
-<file path=customXml/itemProps4.xml><?xml version="1.0" encoding="utf-8"?>
-<ds:datastoreItem xmlns:ds="http://schemas.openxmlformats.org/officeDocument/2006/customXml" ds:itemID="{409E795B-55BB-4B09-A4AF-7E3EFD40BF53}">
-  <ds:schemaRefs>
-    <ds:schemaRef ds:uri="http://schemas.microsoft.com/office/2006/metadata/properties"/>
-    <ds:schemaRef ds:uri="http://schemas.microsoft.com/office/infopath/2007/PartnerControls"/>
-    <ds:schemaRef ds:uri="72c39c84-b0a3-45a2-a38c-ff46bb47f11f"/>
-    <ds:schemaRef ds:uri="cf9f6c1f-8ad0-4eb8-bb2b-fb0b622a341e"/>
-  </ds:schemaRefs>
-</ds:datastoreItem>
 </file>
</xml_diff>